<commit_message>
Align final submission with Feishu deliverables
</commit_message>
<xml_diff>
--- a/提交材料/06_决赛完整方案文档.docx
+++ b/提交材料/06_决赛完整方案文档.docx
@@ -372,7 +372,7 @@
         <w:rPr>
           <w:rFonts w:ascii="Calibri" w:hAnsi="Calibri" w:eastAsia="Microsoft YaHei"/>
         </w:rPr>
-        <w:t>本方案已形成可本地打开的调控师工作台、数据模型、架构文档、飞书协同设计、操作手册、参考文献与决赛补充材料。平台主界面面向企业现场人员，不展示自评打分，不出现模板提示语，核心围绕当班调度的目标负荷、风险边界、下游分配、飞书确认和复盘沉淀。</w:t>
+        <w:t>本方案已形成可本地打开的调控师工作台、数据模型、架构文档、飞书协同设计、操作手册、参考文献与决赛补充材料。平台主界面面向企业现场人员，核心围绕当班调度的目标负荷、风险边界、下游分配、飞书确认和复盘沉淀。</w:t>
       </w:r>
     </w:p>
     <w:p>
@@ -1237,6 +1237,112 @@
         <w:pStyle w:val="Heading1"/>
       </w:pPr>
       <w:r>
+        <w:t>八、方案体验入口与演示说明</w:t>
+      </w:r>
+    </w:p>
+    <w:p>
+      <w:r>
+        <w:rPr>
+          <w:rFonts w:ascii="Calibri" w:hAnsi="Calibri" w:eastAsia="Microsoft YaHei"/>
+        </w:rPr>
+        <w:t>体验入口：本地打开 D:\云图-合成氨-邓植斤\index.html，或访问 GitHub 仓库 https://github.com/zhijinDeng/synthesis-ammonia 查看完整静态平台、数据模型和提交材料。</w:t>
+      </w:r>
+    </w:p>
+    <w:p>
+      <w:r>
+        <w:rPr>
+          <w:rFonts w:ascii="Calibri" w:hAnsi="Calibri" w:eastAsia="Microsoft YaHei"/>
+        </w:rPr>
+        <w:t>演示流程控制在3-5分钟：先切换稳氨、保供、护机、错峰四个场景；再拖动订单、能源、设备健康和库存滑块；随后展示APC/RTO对接、机理/PINN可信模型、飞书卡片/审批/多维表格复盘和知识库自迭代。</w:t>
+      </w:r>
+    </w:p>
+    <w:p>
+      <w:pPr>
+        <w:pStyle w:val="Heading1"/>
+      </w:pPr>
+      <w:r>
+        <w:t>九、自由展示区</w:t>
+      </w:r>
+    </w:p>
+    <w:p>
+      <w:pPr>
+        <w:pStyle w:val="ListBullet"/>
+      </w:pPr>
+      <w:r>
+        <w:rPr>
+          <w:rFonts w:ascii="Calibri" w:hAnsi="Calibri" w:eastAsia="Microsoft YaHei"/>
+        </w:rPr>
+        <w:t>项目已形成可交互页面、可复现生成脚本、数据模型、Word提交材料和GitHub开放仓库。</w:t>
+      </w:r>
+    </w:p>
+    <w:p>
+      <w:pPr>
+        <w:pStyle w:val="ListBullet"/>
+      </w:pPr>
+      <w:r>
+        <w:rPr>
+          <w:rFonts w:ascii="Calibri" w:hAnsi="Calibri" w:eastAsia="Microsoft YaHei"/>
+        </w:rPr>
+        <w:t>方案语言保持企业现场视角，聚焦装置运行、班组协同、收益核算和知识沉淀。</w:t>
+      </w:r>
+    </w:p>
+    <w:p>
+      <w:pPr>
+        <w:pStyle w:val="ListBullet"/>
+      </w:pPr>
+      <w:r>
+        <w:rPr>
+          <w:rFonts w:ascii="Calibri" w:hAnsi="Calibri" w:eastAsia="Microsoft YaHei"/>
+        </w:rPr>
+        <w:t>首轮优势是结构化闭环和落地路径；决赛版进一步补上控制体系对接、模型可信度和飞书组织协同。</w:t>
+      </w:r>
+    </w:p>
+    <w:p>
+      <w:pPr>
+        <w:pStyle w:val="Heading1"/>
+      </w:pPr>
+      <w:r>
+        <w:t>十、附录</w:t>
+      </w:r>
+    </w:p>
+    <w:p>
+      <w:pPr>
+        <w:pStyle w:val="ListBullet"/>
+      </w:pPr>
+      <w:r>
+        <w:rPr>
+          <w:rFonts w:ascii="Calibri" w:hAnsi="Calibri" w:eastAsia="Microsoft YaHei"/>
+        </w:rPr>
+        <w:t>附录A：参考文献与数据依据见 04_参考文献与数据依据.docx。</w:t>
+      </w:r>
+    </w:p>
+    <w:p>
+      <w:pPr>
+        <w:pStyle w:val="ListBullet"/>
+      </w:pPr>
+      <w:r>
+        <w:rPr>
+          <w:rFonts w:ascii="Calibri" w:hAnsi="Calibri" w:eastAsia="Microsoft YaHei"/>
+        </w:rPr>
+        <w:t>附录B：调控师班组使用流程见 03_调控师操作手册.docx。</w:t>
+      </w:r>
+    </w:p>
+    <w:p>
+      <w:pPr>
+        <w:pStyle w:val="ListBullet"/>
+      </w:pPr>
+      <w:r>
+        <w:rPr>
+          <w:rFonts w:ascii="Calibri" w:hAnsi="Calibri" w:eastAsia="Microsoft YaHei"/>
+        </w:rPr>
+        <w:t>附录C：飞书真实接入需企业自建应用、审批定义、多维表格权限和事件回调配置。</w:t>
+      </w:r>
+    </w:p>
+    <w:p>
+      <w:pPr>
+        <w:pStyle w:val="Heading1"/>
+      </w:pPr>
+      <w:r>
         <w:t>参考文献与资料来源</w:t>
       </w:r>
     </w:p>

</xml_diff>

<commit_message>
Add concrete Feishu workflow integration
</commit_message>
<xml_diff>
--- a/提交材料/06_决赛完整方案文档.docx
+++ b/提交材料/06_决赛完整方案文档.docx
@@ -1192,6 +1192,14 @@
       </w:tr>
     </w:tbl>
     <w:p>
+      <w:r>
+        <w:rPr>
+          <w:rFonts w:ascii="Calibri" w:hAnsi="Calibri" w:eastAsia="Microsoft YaHei"/>
+        </w:rPr>
+        <w:t>本轮已完成两项飞书原型交付：决赛完整方案在线稿 https://larkcommunity.feishu.cn/docx/AYyad50itooOPxxZpQacgSqIn2c ；合成氨调度复盘库 Base 原型 https://larkcommunity.feishu.cn/base/QzENbAkl1aYQGds8dBacqu6Inue 。企业真实试点时，可将互动卡片按钮、审批状态和多维表格记录通过事件回调串成一条执行链。</w:t>
+      </w:r>
+    </w:p>
+    <w:p>
       <w:pPr>
         <w:pStyle w:val="Heading1"/>
       </w:pPr>

</xml_diff>

<commit_message>
feat: add auditable dispatch evidence package
</commit_message>
<xml_diff>
--- a/提交材料/06_决赛完整方案文档.docx
+++ b/提交材料/06_决赛完整方案文档.docx
@@ -12378,6 +12378,26 @@
           <w:lang w:eastAsia="zh-CN"/>
         </w:rPr>
         <w:t>：飞书真实接入需企业自建应用、审批定义、多维表格权限和事件回调配置。</w:t>
+      </w:r>
+    </w:p>
+    <w:p>
+      <w:pPr>
+        <w:pStyle w:val="1"/>
+      </w:pPr>
+      <w:r>
+        <w:t>十一、方案证据包与企业交接</w:t>
+      </w:r>
+    </w:p>
+    <w:p>
+      <w:pPr/>
+      <w:r>
+        <w:t>当班工作区提供“导出当前方案证据包”操作，将当次输入快照、执行价版本、安全与可行性闸门、液氨平衡、跨装置动作单、接令状态、飞书流转状态和审计事件收纳为一份 JSON 交接物。字段契约保存于 data/evidence_package_schema.json，便于班长复核、企业专家抽查和后续写入飞书多维表格。</w:t>
+      </w:r>
+    </w:p>
+    <w:p>
+      <w:pPr/>
+      <w:r>
+        <w:t>该文件与平台写回分开：导出不等同于飞书审批或现场执行，不写入 DCS/SIS。未接入 Historian 或企业认可的事实源时，实际负荷、库存、能耗和收益字段保持为空，不用样例数值冒充执行结果。</w:t>
       </w:r>
     </w:p>
     <w:p>

</xml_diff>